<commit_message>
Ley 32353: vigencia sujeta a su reglamento; SOB-07 y TAL-02 remiten al régimen vigente
</commit_message>
<xml_diff>
--- a/docx/SOB-07.docx
+++ b/docx/SOB-07.docx
@@ -74,7 +74,7 @@
         <w:br/>
       </w:r>
       <w:r>
-        <w:t>2.1 La presente ley se aplica a las micro, pequeñas y medianas empresas que desarrollan actividades manufactureras, conforme a los umbrales del Texto Único Ordenado de la Ley de Impulso al Desarrollo Productivo y al Crecimiento Empresarial, aprobado por el Decreto Supremo 013-2013-PRODUCE. 2.2 Se entiende por manufactura avanzada el uso de automatización industrial, robots industriales y colaborativos, visión artificial, sensórica e internet industrial de las cosas, fabricación aditiva, gemelos digitales y sistemas de gestión de la producción basados en datos.</w:t>
+        <w:t>2.1 La presente ley se aplica a las micro, pequeñas y medianas empresas que desarrollan actividades manufactureras, conforme a los umbrales del Texto Único Ordenado de la Ley de Impulso al Desarrollo Productivo y al Crecimiento Empresarial, aprobado por el Decreto Supremo 013-2013-PRODUCE, o, desde su entrada en vigor, de la Ley 32353, Ley para la Formalización, Desarrollo y Competitividad de la Micro y Pequeña Empresa. 2.2 Se entiende por manufactura avanzada el uso de automatización industrial, robots industriales y colaborativos, visión artificial, sensórica e internet industrial de las cosas, fabricación aditiva, gemelos digitales y sistemas de gestión de la producción basados en datos.</w:t>
       </w:r>
     </w:p>
     <w:p>
@@ -321,7 +321,7 @@
         <w:jc w:val="both"/>
       </w:pPr>
       <w:r>
-        <w:t>Complementa el Decreto Legislativo 1228 y su reglamento, el Texto Único Ordenado aprobado por Decreto Supremo 013-2013-PRODUCE, la Ley 29783 y su reglamento (Decreto Supremo 005-2012-TR) y la Ley 30224. Se concuerda con el artículo 19 de la Ley 30512 y remite a las propuestas sobre formación de corta duración (TAL-04) y reconversión laboral por automatización (IA-13), sin crear reglas laborales especiales. No deroga normas.</w:t>
+        <w:t>Complementa el Decreto Legislativo 1228 y su reglamento, el Texto Único Ordenado aprobado por Decreto Supremo 013-2013-PRODUCE (o la Ley 32353 desde su entrada en vigor), la Ley 29783 y su reglamento (Decreto Supremo 005-2012-TR) y la Ley 30224. Se concuerda con el artículo 19 de la Ley 30512 y remite a las propuestas sobre formación de corta duración (TAL-04) y reconversión laboral por automatización (IA-13), sin crear reglas laborales especiales. No deroga normas.</w:t>
       </w:r>
     </w:p>
     <w:p>

</xml_diff>